<commit_message>
Agrega indicadores de robustez (TRD, Brecha de error, RBE) con formulas al informe; agrega graficas de matriz de confusion y ROC de Trucha (ViT-Base/16, DenseNet-121)
Co-Authored-By: Claude Sonnet 5 <noreply@anthropic.com>
</commit_message>
<xml_diff>
--- a/Resultados_ViT_DenseNet.docx
+++ b/Resultados_ViT_DenseNet.docx
@@ -924,7 +924,7 @@
         <w:spacing w:after="120" w:before="200"/>
       </w:pPr>
       <w:r>
-        <w:t xml:space="preserve">4. Lectura</w:t>
+        <w:t xml:space="preserve">4. Indicadores de robustez ante cambio de dominio</w:t>
       </w:r>
     </w:p>
     <w:p>
@@ -932,6 +932,1414 @@
         <w:spacing w:after="100"/>
       </w:pPr>
       <w:r>
+        <w:t xml:space="preserve">Indicadores del plan de tesis (Dimensión 2 — Robustez ante el Cambio de Dominio), calculados a partir del F1 macro de cada modelo en Mendeley (dominio fuente) y en cada dominio objetivo.</w:t>
+      </w:r>
+    </w:p>
+    <w:p>
+      <w:pPr>
+        <w:pStyle w:val="Heading2"/>
+        <w:spacing w:after="80" w:before="160"/>
+      </w:pPr>
+      <w:r>
+        <w:t xml:space="preserve">4.1 Fórmulas</w:t>
+      </w:r>
+    </w:p>
+    <w:p>
+      <w:pPr>
+        <w:spacing w:after="100"/>
+      </w:pPr>
+      <w:r>
+        <w:rPr>
+          <w:b/>
+          <w:bCs/>
+        </w:rPr>
+        <w:t xml:space="preserve">Tasa de Retención del Desempeño (TRD):</w:t>
+      </w:r>
+    </w:p>
+    <w:p>
+      <w:pPr>
+        <w:spacing w:after="100"/>
+      </w:pPr>
+      <w:r>
+        <w:rPr>
+          <w:i/>
+          <w:iCs/>
+        </w:rPr>
+        <w:t xml:space="preserve">TRD = (F1_objetivo / F1_fuente) × 100</w:t>
+      </w:r>
+    </w:p>
+    <w:p>
+      <w:pPr>
+        <w:spacing w:after="100"/>
+      </w:pPr>
+      <w:r>
+        <w:t xml:space="preserve">Porcentaje del desempeño de Mendeley que el modelo conserva al evaluarse en el dominio objetivo. 100% = sin caída de desempeño.</w:t>
+      </w:r>
+    </w:p>
+    <w:p>
+      <w:pPr>
+        <w:spacing w:after="100"/>
+      </w:pPr>
+      <w:r>
+        <w:rPr>
+          <w:b/>
+          <w:bCs/>
+        </w:rPr>
+        <w:t xml:space="preserve">Brecha de Error (Gap):</w:t>
+      </w:r>
+    </w:p>
+    <w:p>
+      <w:pPr>
+        <w:spacing w:after="100"/>
+      </w:pPr>
+      <w:r>
+        <w:rPr>
+          <w:i/>
+          <w:iCs/>
+        </w:rPr>
+        <w:t xml:space="preserve">Error = 1 − F1/100     Gap = Error_objetivo − Error_fuente</w:t>
+      </w:r>
+    </w:p>
+    <w:p>
+      <w:pPr>
+        <w:spacing w:after="100"/>
+      </w:pPr>
+      <w:r>
+        <w:t xml:space="preserve">Cuánto aumenta el error del modelo al pasar del dominio fuente al objetivo. Gap = 0 significaría que el modelo no pierde nada de desempeño.</w:t>
+      </w:r>
+    </w:p>
+    <w:p>
+      <w:pPr>
+        <w:spacing w:after="100"/>
+      </w:pPr>
+      <w:r>
+        <w:rPr>
+          <w:b/>
+          <w:bCs/>
+        </w:rPr>
+        <w:t xml:space="preserve">Reducción de Brecha de Error (RBE), respecto a DenseNet-121 (baseline CNN):</w:t>
+      </w:r>
+    </w:p>
+    <w:p>
+      <w:pPr>
+        <w:spacing w:after="100"/>
+      </w:pPr>
+      <w:r>
+        <w:rPr>
+          <w:i/>
+          <w:iCs/>
+        </w:rPr>
+        <w:t xml:space="preserve">RBE = (Gap_baseline − Gap_modelo) / Gap_baseline × 100</w:t>
+      </w:r>
+    </w:p>
+    <w:p>
+      <w:pPr>
+        <w:spacing w:after="100"/>
+      </w:pPr>
+      <w:r>
+        <w:t xml:space="preserve">Mide cuánto reduce cada modelo la brecha de error frente al baseline (DenseNet-121). RBE &gt; 0 = mejor transferencia que el baseline; RBE &lt; 0 = peor. Para el propio baseline, Gap_baseline = Gap_modelo, así que RBE = 0.0 exacto — es una tautología (comparación contra sí mismo), no una medición independiente, y se muestra igual para no dejar la celda vacía.</w:t>
+      </w:r>
+    </w:p>
+    <w:p>
+      <w:pPr>
+        <w:pStyle w:val="Heading2"/>
+        <w:spacing w:after="80" w:before="160"/>
+      </w:pPr>
+      <w:r>
+        <w:t xml:space="preserve">4.2 Indicadores — con augmentación x2</w:t>
+      </w:r>
+    </w:p>
+    <w:p>
+      <w:pPr>
+        <w:pStyle w:val="Heading2"/>
+        <w:spacing w:after="80" w:before="160"/>
+      </w:pPr>
+      <w:r>
+        <w:t xml:space="preserve">Trucha</w:t>
+      </w:r>
+    </w:p>
+    <w:tbl>
+      <w:tblPr>
+        <w:tblW w:type="dxa" w:w="13200"/>
+        <w:tblBorders>
+          <w:top w:val="single" w:color="auto" w:sz="4"/>
+          <w:left w:val="single" w:color="auto" w:sz="4"/>
+          <w:bottom w:val="single" w:color="auto" w:sz="4"/>
+          <w:right w:val="single" w:color="auto" w:sz="4"/>
+          <w:insideH w:val="single" w:color="auto" w:sz="4"/>
+          <w:insideV w:val="single" w:color="auto" w:sz="4"/>
+        </w:tblBorders>
+      </w:tblPr>
+      <w:tblGrid>
+        <w:gridCol w:w="4000"/>
+        <w:gridCol w:w="2800"/>
+        <w:gridCol w:w="2800"/>
+        <w:gridCol w:w="3600"/>
+      </w:tblGrid>
+      <w:tr>
+        <w:trPr>
+          <w:tblHeader/>
+        </w:trPr>
+        <w:tc>
+          <w:tcPr>
+            <w:tcW w:type="dxa" w:w="4000"/>
+            <w:shd w:fill="D9E2F3" w:val="clear"/>
+            <w:tcMar>
+              <w:top w:type="dxa" w:w="60"/>
+              <w:left w:type="dxa" w:w="100"/>
+              <w:bottom w:type="dxa" w:w="60"/>
+              <w:right w:type="dxa" w:w="100"/>
+            </w:tcMar>
+          </w:tcPr>
+          <w:p>
+            <w:pPr>
+              <w:jc w:val="center"/>
+            </w:pPr>
+            <w:r>
+              <w:rPr>
+                <w:b/>
+                <w:bCs/>
+              </w:rPr>
+              <w:t xml:space="preserve">Modelo</w:t>
+            </w:r>
+          </w:p>
+        </w:tc>
+        <w:tc>
+          <w:tcPr>
+            <w:tcW w:type="dxa" w:w="2800"/>
+            <w:shd w:fill="D9E2F3" w:val="clear"/>
+            <w:tcMar>
+              <w:top w:type="dxa" w:w="60"/>
+              <w:left w:type="dxa" w:w="100"/>
+              <w:bottom w:type="dxa" w:w="60"/>
+              <w:right w:type="dxa" w:w="100"/>
+            </w:tcMar>
+          </w:tcPr>
+          <w:p>
+            <w:pPr>
+              <w:jc w:val="center"/>
+            </w:pPr>
+            <w:r>
+              <w:rPr>
+                <w:b/>
+                <w:bCs/>
+              </w:rPr>
+              <w:t xml:space="preserve">TRD (%)</w:t>
+            </w:r>
+          </w:p>
+        </w:tc>
+        <w:tc>
+          <w:tcPr>
+            <w:tcW w:type="dxa" w:w="2800"/>
+            <w:shd w:fill="D9E2F3" w:val="clear"/>
+            <w:tcMar>
+              <w:top w:type="dxa" w:w="60"/>
+              <w:left w:type="dxa" w:w="100"/>
+              <w:bottom w:type="dxa" w:w="60"/>
+              <w:right w:type="dxa" w:w="100"/>
+            </w:tcMar>
+          </w:tcPr>
+          <w:p>
+            <w:pPr>
+              <w:jc w:val="center"/>
+            </w:pPr>
+            <w:r>
+              <w:rPr>
+                <w:b/>
+                <w:bCs/>
+              </w:rPr>
+              <w:t xml:space="preserve">Gap</w:t>
+            </w:r>
+          </w:p>
+        </w:tc>
+        <w:tc>
+          <w:tcPr>
+            <w:tcW w:type="dxa" w:w="3600"/>
+            <w:shd w:fill="D9E2F3" w:val="clear"/>
+            <w:tcMar>
+              <w:top w:type="dxa" w:w="60"/>
+              <w:left w:type="dxa" w:w="100"/>
+              <w:bottom w:type="dxa" w:w="60"/>
+              <w:right w:type="dxa" w:w="100"/>
+            </w:tcMar>
+          </w:tcPr>
+          <w:p>
+            <w:pPr>
+              <w:jc w:val="center"/>
+            </w:pPr>
+            <w:r>
+              <w:rPr>
+                <w:b/>
+                <w:bCs/>
+              </w:rPr>
+              <w:t xml:space="preserve">RBE vs. DenseNet-121 (%)</w:t>
+            </w:r>
+          </w:p>
+        </w:tc>
+      </w:tr>
+      <w:tr>
+        <w:tc>
+          <w:tcPr>
+            <w:tcW w:type="dxa" w:w="4000"/>
+            <w:tcMar>
+              <w:top w:type="dxa" w:w="60"/>
+              <w:left w:type="dxa" w:w="100"/>
+              <w:bottom w:type="dxa" w:w="60"/>
+              <w:right w:type="dxa" w:w="100"/>
+            </w:tcMar>
+          </w:tcPr>
+          <w:p>
+            <w:pPr>
+              <w:jc w:val="center"/>
+            </w:pPr>
+            <w:r>
+              <w:rPr>
+                <w:b w:val="false"/>
+                <w:bCs w:val="false"/>
+              </w:rPr>
+              <w:t xml:space="preserve">ViT-Base/16</w:t>
+            </w:r>
+          </w:p>
+        </w:tc>
+        <w:tc>
+          <w:tcPr>
+            <w:tcW w:type="dxa" w:w="2800"/>
+            <w:tcMar>
+              <w:top w:type="dxa" w:w="60"/>
+              <w:left w:type="dxa" w:w="100"/>
+              <w:bottom w:type="dxa" w:w="60"/>
+              <w:right w:type="dxa" w:w="100"/>
+            </w:tcMar>
+          </w:tcPr>
+          <w:p>
+            <w:pPr>
+              <w:jc w:val="center"/>
+            </w:pPr>
+            <w:r>
+              <w:rPr>
+                <w:b w:val="false"/>
+                <w:bCs w:val="false"/>
+              </w:rPr>
+              <w:t xml:space="preserve">91.77</w:t>
+            </w:r>
+          </w:p>
+        </w:tc>
+        <w:tc>
+          <w:tcPr>
+            <w:tcW w:type="dxa" w:w="2800"/>
+            <w:tcMar>
+              <w:top w:type="dxa" w:w="60"/>
+              <w:left w:type="dxa" w:w="100"/>
+              <w:bottom w:type="dxa" w:w="60"/>
+              <w:right w:type="dxa" w:w="100"/>
+            </w:tcMar>
+          </w:tcPr>
+          <w:p>
+            <w:pPr>
+              <w:jc w:val="center"/>
+            </w:pPr>
+            <w:r>
+              <w:rPr>
+                <w:b w:val="false"/>
+                <w:bCs w:val="false"/>
+              </w:rPr>
+              <w:t xml:space="preserve">0.0798</w:t>
+            </w:r>
+          </w:p>
+        </w:tc>
+        <w:tc>
+          <w:tcPr>
+            <w:tcW w:type="dxa" w:w="3600"/>
+            <w:tcMar>
+              <w:top w:type="dxa" w:w="60"/>
+              <w:left w:type="dxa" w:w="100"/>
+              <w:bottom w:type="dxa" w:w="60"/>
+              <w:right w:type="dxa" w:w="100"/>
+            </w:tcMar>
+          </w:tcPr>
+          <w:p>
+            <w:pPr>
+              <w:jc w:val="center"/>
+            </w:pPr>
+            <w:r>
+              <w:rPr>
+                <w:b w:val="false"/>
+                <w:bCs w:val="false"/>
+              </w:rPr>
+              <w:t xml:space="preserve">18.15</w:t>
+            </w:r>
+          </w:p>
+        </w:tc>
+      </w:tr>
+      <w:tr>
+        <w:tc>
+          <w:tcPr>
+            <w:tcW w:type="dxa" w:w="4000"/>
+            <w:tcMar>
+              <w:top w:type="dxa" w:w="60"/>
+              <w:left w:type="dxa" w:w="100"/>
+              <w:bottom w:type="dxa" w:w="60"/>
+              <w:right w:type="dxa" w:w="100"/>
+            </w:tcMar>
+          </w:tcPr>
+          <w:p>
+            <w:pPr>
+              <w:jc w:val="center"/>
+            </w:pPr>
+            <w:r>
+              <w:rPr>
+                <w:b w:val="false"/>
+                <w:bCs w:val="false"/>
+              </w:rPr>
+              <w:t xml:space="preserve">DenseNet-121 (baseline)</w:t>
+            </w:r>
+          </w:p>
+        </w:tc>
+        <w:tc>
+          <w:tcPr>
+            <w:tcW w:type="dxa" w:w="2800"/>
+            <w:tcMar>
+              <w:top w:type="dxa" w:w="60"/>
+              <w:left w:type="dxa" w:w="100"/>
+              <w:bottom w:type="dxa" w:w="60"/>
+              <w:right w:type="dxa" w:w="100"/>
+            </w:tcMar>
+          </w:tcPr>
+          <w:p>
+            <w:pPr>
+              <w:jc w:val="center"/>
+            </w:pPr>
+            <w:r>
+              <w:rPr>
+                <w:b w:val="false"/>
+                <w:bCs w:val="false"/>
+              </w:rPr>
+              <w:t xml:space="preserve">89.81</w:t>
+            </w:r>
+          </w:p>
+        </w:tc>
+        <w:tc>
+          <w:tcPr>
+            <w:tcW w:type="dxa" w:w="2800"/>
+            <w:tcMar>
+              <w:top w:type="dxa" w:w="60"/>
+              <w:left w:type="dxa" w:w="100"/>
+              <w:bottom w:type="dxa" w:w="60"/>
+              <w:right w:type="dxa" w:w="100"/>
+            </w:tcMar>
+          </w:tcPr>
+          <w:p>
+            <w:pPr>
+              <w:jc w:val="center"/>
+            </w:pPr>
+            <w:r>
+              <w:rPr>
+                <w:b w:val="false"/>
+                <w:bCs w:val="false"/>
+              </w:rPr>
+              <w:t xml:space="preserve">0.0975</w:t>
+            </w:r>
+          </w:p>
+        </w:tc>
+        <w:tc>
+          <w:tcPr>
+            <w:tcW w:type="dxa" w:w="3600"/>
+            <w:tcMar>
+              <w:top w:type="dxa" w:w="60"/>
+              <w:left w:type="dxa" w:w="100"/>
+              <w:bottom w:type="dxa" w:w="60"/>
+              <w:right w:type="dxa" w:w="100"/>
+            </w:tcMar>
+          </w:tcPr>
+          <w:p>
+            <w:pPr>
+              <w:jc w:val="center"/>
+            </w:pPr>
+            <w:r>
+              <w:rPr>
+                <w:b w:val="false"/>
+                <w:bCs w:val="false"/>
+              </w:rPr>
+              <w:t xml:space="preserve">0.00</w:t>
+            </w:r>
+          </w:p>
+        </w:tc>
+      </w:tr>
+    </w:tbl>
+    <w:p>
+      <w:pPr>
+        <w:pStyle w:val="Heading2"/>
+        <w:spacing w:after="80" w:before="160"/>
+      </w:pPr>
+      <w:r>
+        <w:t xml:space="preserve">Rohu</w:t>
+      </w:r>
+    </w:p>
+    <w:tbl>
+      <w:tblPr>
+        <w:tblW w:type="dxa" w:w="13200"/>
+        <w:tblBorders>
+          <w:top w:val="single" w:color="auto" w:sz="4"/>
+          <w:left w:val="single" w:color="auto" w:sz="4"/>
+          <w:bottom w:val="single" w:color="auto" w:sz="4"/>
+          <w:right w:val="single" w:color="auto" w:sz="4"/>
+          <w:insideH w:val="single" w:color="auto" w:sz="4"/>
+          <w:insideV w:val="single" w:color="auto" w:sz="4"/>
+        </w:tblBorders>
+      </w:tblPr>
+      <w:tblGrid>
+        <w:gridCol w:w="4000"/>
+        <w:gridCol w:w="2800"/>
+        <w:gridCol w:w="2800"/>
+        <w:gridCol w:w="3600"/>
+      </w:tblGrid>
+      <w:tr>
+        <w:trPr>
+          <w:tblHeader/>
+        </w:trPr>
+        <w:tc>
+          <w:tcPr>
+            <w:tcW w:type="dxa" w:w="4000"/>
+            <w:shd w:fill="D9E2F3" w:val="clear"/>
+            <w:tcMar>
+              <w:top w:type="dxa" w:w="60"/>
+              <w:left w:type="dxa" w:w="100"/>
+              <w:bottom w:type="dxa" w:w="60"/>
+              <w:right w:type="dxa" w:w="100"/>
+            </w:tcMar>
+          </w:tcPr>
+          <w:p>
+            <w:pPr>
+              <w:jc w:val="center"/>
+            </w:pPr>
+            <w:r>
+              <w:rPr>
+                <w:b/>
+                <w:bCs/>
+              </w:rPr>
+              <w:t xml:space="preserve">Modelo</w:t>
+            </w:r>
+          </w:p>
+        </w:tc>
+        <w:tc>
+          <w:tcPr>
+            <w:tcW w:type="dxa" w:w="2800"/>
+            <w:shd w:fill="D9E2F3" w:val="clear"/>
+            <w:tcMar>
+              <w:top w:type="dxa" w:w="60"/>
+              <w:left w:type="dxa" w:w="100"/>
+              <w:bottom w:type="dxa" w:w="60"/>
+              <w:right w:type="dxa" w:w="100"/>
+            </w:tcMar>
+          </w:tcPr>
+          <w:p>
+            <w:pPr>
+              <w:jc w:val="center"/>
+            </w:pPr>
+            <w:r>
+              <w:rPr>
+                <w:b/>
+                <w:bCs/>
+              </w:rPr>
+              <w:t xml:space="preserve">TRD (%)</w:t>
+            </w:r>
+          </w:p>
+        </w:tc>
+        <w:tc>
+          <w:tcPr>
+            <w:tcW w:type="dxa" w:w="2800"/>
+            <w:shd w:fill="D9E2F3" w:val="clear"/>
+            <w:tcMar>
+              <w:top w:type="dxa" w:w="60"/>
+              <w:left w:type="dxa" w:w="100"/>
+              <w:bottom w:type="dxa" w:w="60"/>
+              <w:right w:type="dxa" w:w="100"/>
+            </w:tcMar>
+          </w:tcPr>
+          <w:p>
+            <w:pPr>
+              <w:jc w:val="center"/>
+            </w:pPr>
+            <w:r>
+              <w:rPr>
+                <w:b/>
+                <w:bCs/>
+              </w:rPr>
+              <w:t xml:space="preserve">Gap</w:t>
+            </w:r>
+          </w:p>
+        </w:tc>
+        <w:tc>
+          <w:tcPr>
+            <w:tcW w:type="dxa" w:w="3600"/>
+            <w:shd w:fill="D9E2F3" w:val="clear"/>
+            <w:tcMar>
+              <w:top w:type="dxa" w:w="60"/>
+              <w:left w:type="dxa" w:w="100"/>
+              <w:bottom w:type="dxa" w:w="60"/>
+              <w:right w:type="dxa" w:w="100"/>
+            </w:tcMar>
+          </w:tcPr>
+          <w:p>
+            <w:pPr>
+              <w:jc w:val="center"/>
+            </w:pPr>
+            <w:r>
+              <w:rPr>
+                <w:b/>
+                <w:bCs/>
+              </w:rPr>
+              <w:t xml:space="preserve">RBE vs. DenseNet-121 (%)</w:t>
+            </w:r>
+          </w:p>
+        </w:tc>
+      </w:tr>
+      <w:tr>
+        <w:tc>
+          <w:tcPr>
+            <w:tcW w:type="dxa" w:w="4000"/>
+            <w:tcMar>
+              <w:top w:type="dxa" w:w="60"/>
+              <w:left w:type="dxa" w:w="100"/>
+              <w:bottom w:type="dxa" w:w="60"/>
+              <w:right w:type="dxa" w:w="100"/>
+            </w:tcMar>
+          </w:tcPr>
+          <w:p>
+            <w:pPr>
+              <w:jc w:val="center"/>
+            </w:pPr>
+            <w:r>
+              <w:rPr>
+                <w:b w:val="false"/>
+                <w:bCs w:val="false"/>
+              </w:rPr>
+              <w:t xml:space="preserve">ViT-Base/16</w:t>
+            </w:r>
+          </w:p>
+        </w:tc>
+        <w:tc>
+          <w:tcPr>
+            <w:tcW w:type="dxa" w:w="2800"/>
+            <w:tcMar>
+              <w:top w:type="dxa" w:w="60"/>
+              <w:left w:type="dxa" w:w="100"/>
+              <w:bottom w:type="dxa" w:w="60"/>
+              <w:right w:type="dxa" w:w="100"/>
+            </w:tcMar>
+          </w:tcPr>
+          <w:p>
+            <w:pPr>
+              <w:jc w:val="center"/>
+            </w:pPr>
+            <w:r>
+              <w:rPr>
+                <w:b w:val="false"/>
+                <w:bCs w:val="false"/>
+              </w:rPr>
+              <w:t xml:space="preserve">93.98</w:t>
+            </w:r>
+          </w:p>
+        </w:tc>
+        <w:tc>
+          <w:tcPr>
+            <w:tcW w:type="dxa" w:w="2800"/>
+            <w:tcMar>
+              <w:top w:type="dxa" w:w="60"/>
+              <w:left w:type="dxa" w:w="100"/>
+              <w:bottom w:type="dxa" w:w="60"/>
+              <w:right w:type="dxa" w:w="100"/>
+            </w:tcMar>
+          </w:tcPr>
+          <w:p>
+            <w:pPr>
+              <w:jc w:val="center"/>
+            </w:pPr>
+            <w:r>
+              <w:rPr>
+                <w:b w:val="false"/>
+                <w:bCs w:val="false"/>
+              </w:rPr>
+              <w:t xml:space="preserve">0.0584</w:t>
+            </w:r>
+          </w:p>
+        </w:tc>
+        <w:tc>
+          <w:tcPr>
+            <w:tcW w:type="dxa" w:w="3600"/>
+            <w:tcMar>
+              <w:top w:type="dxa" w:w="60"/>
+              <w:left w:type="dxa" w:w="100"/>
+              <w:bottom w:type="dxa" w:w="60"/>
+              <w:right w:type="dxa" w:w="100"/>
+            </w:tcMar>
+          </w:tcPr>
+          <w:p>
+            <w:pPr>
+              <w:jc w:val="center"/>
+            </w:pPr>
+            <w:r>
+              <w:rPr>
+                <w:b w:val="false"/>
+                <w:bCs w:val="false"/>
+              </w:rPr>
+              <w:t xml:space="preserve">35.68</w:t>
+            </w:r>
+          </w:p>
+        </w:tc>
+      </w:tr>
+      <w:tr>
+        <w:tc>
+          <w:tcPr>
+            <w:tcW w:type="dxa" w:w="4000"/>
+            <w:tcMar>
+              <w:top w:type="dxa" w:w="60"/>
+              <w:left w:type="dxa" w:w="100"/>
+              <w:bottom w:type="dxa" w:w="60"/>
+              <w:right w:type="dxa" w:w="100"/>
+            </w:tcMar>
+          </w:tcPr>
+          <w:p>
+            <w:pPr>
+              <w:jc w:val="center"/>
+            </w:pPr>
+            <w:r>
+              <w:rPr>
+                <w:b w:val="false"/>
+                <w:bCs w:val="false"/>
+              </w:rPr>
+              <w:t xml:space="preserve">DenseNet-121 (baseline)</w:t>
+            </w:r>
+          </w:p>
+        </w:tc>
+        <w:tc>
+          <w:tcPr>
+            <w:tcW w:type="dxa" w:w="2800"/>
+            <w:tcMar>
+              <w:top w:type="dxa" w:w="60"/>
+              <w:left w:type="dxa" w:w="100"/>
+              <w:bottom w:type="dxa" w:w="60"/>
+              <w:right w:type="dxa" w:w="100"/>
+            </w:tcMar>
+          </w:tcPr>
+          <w:p>
+            <w:pPr>
+              <w:jc w:val="center"/>
+            </w:pPr>
+            <w:r>
+              <w:rPr>
+                <w:b w:val="false"/>
+                <w:bCs w:val="false"/>
+              </w:rPr>
+              <w:t xml:space="preserve">90.51</w:t>
+            </w:r>
+          </w:p>
+        </w:tc>
+        <w:tc>
+          <w:tcPr>
+            <w:tcW w:type="dxa" w:w="2800"/>
+            <w:tcMar>
+              <w:top w:type="dxa" w:w="60"/>
+              <w:left w:type="dxa" w:w="100"/>
+              <w:bottom w:type="dxa" w:w="60"/>
+              <w:right w:type="dxa" w:w="100"/>
+            </w:tcMar>
+          </w:tcPr>
+          <w:p>
+            <w:pPr>
+              <w:jc w:val="center"/>
+            </w:pPr>
+            <w:r>
+              <w:rPr>
+                <w:b w:val="false"/>
+                <w:bCs w:val="false"/>
+              </w:rPr>
+              <w:t xml:space="preserve">0.0908</w:t>
+            </w:r>
+          </w:p>
+        </w:tc>
+        <w:tc>
+          <w:tcPr>
+            <w:tcW w:type="dxa" w:w="3600"/>
+            <w:tcMar>
+              <w:top w:type="dxa" w:w="60"/>
+              <w:left w:type="dxa" w:w="100"/>
+              <w:bottom w:type="dxa" w:w="60"/>
+              <w:right w:type="dxa" w:w="100"/>
+            </w:tcMar>
+          </w:tcPr>
+          <w:p>
+            <w:pPr>
+              <w:jc w:val="center"/>
+            </w:pPr>
+            <w:r>
+              <w:rPr>
+                <w:b w:val="false"/>
+                <w:bCs w:val="false"/>
+              </w:rPr>
+              <w:t xml:space="preserve">0.00</w:t>
+            </w:r>
+          </w:p>
+        </w:tc>
+      </w:tr>
+    </w:tbl>
+    <w:p>
+      <w:pPr>
+        <w:pStyle w:val="Heading2"/>
+        <w:spacing w:after="80" w:before="160"/>
+      </w:pPr>
+      <w:r>
+        <w:t xml:space="preserve">4.3 Indicadores — sin augmentación (sin x2)</w:t>
+      </w:r>
+    </w:p>
+    <w:p>
+      <w:pPr>
+        <w:pStyle w:val="Heading2"/>
+        <w:spacing w:after="80" w:before="160"/>
+      </w:pPr>
+      <w:r>
+        <w:t xml:space="preserve">Trucha</w:t>
+      </w:r>
+    </w:p>
+    <w:tbl>
+      <w:tblPr>
+        <w:tblW w:type="dxa" w:w="13200"/>
+        <w:tblBorders>
+          <w:top w:val="single" w:color="auto" w:sz="4"/>
+          <w:left w:val="single" w:color="auto" w:sz="4"/>
+          <w:bottom w:val="single" w:color="auto" w:sz="4"/>
+          <w:right w:val="single" w:color="auto" w:sz="4"/>
+          <w:insideH w:val="single" w:color="auto" w:sz="4"/>
+          <w:insideV w:val="single" w:color="auto" w:sz="4"/>
+        </w:tblBorders>
+      </w:tblPr>
+      <w:tblGrid>
+        <w:gridCol w:w="4000"/>
+        <w:gridCol w:w="2800"/>
+        <w:gridCol w:w="2800"/>
+        <w:gridCol w:w="3600"/>
+      </w:tblGrid>
+      <w:tr>
+        <w:trPr>
+          <w:tblHeader/>
+        </w:trPr>
+        <w:tc>
+          <w:tcPr>
+            <w:tcW w:type="dxa" w:w="4000"/>
+            <w:shd w:fill="D9E2F3" w:val="clear"/>
+            <w:tcMar>
+              <w:top w:type="dxa" w:w="60"/>
+              <w:left w:type="dxa" w:w="100"/>
+              <w:bottom w:type="dxa" w:w="60"/>
+              <w:right w:type="dxa" w:w="100"/>
+            </w:tcMar>
+          </w:tcPr>
+          <w:p>
+            <w:pPr>
+              <w:jc w:val="center"/>
+            </w:pPr>
+            <w:r>
+              <w:rPr>
+                <w:b/>
+                <w:bCs/>
+              </w:rPr>
+              <w:t xml:space="preserve">Modelo</w:t>
+            </w:r>
+          </w:p>
+        </w:tc>
+        <w:tc>
+          <w:tcPr>
+            <w:tcW w:type="dxa" w:w="2800"/>
+            <w:shd w:fill="D9E2F3" w:val="clear"/>
+            <w:tcMar>
+              <w:top w:type="dxa" w:w="60"/>
+              <w:left w:type="dxa" w:w="100"/>
+              <w:bottom w:type="dxa" w:w="60"/>
+              <w:right w:type="dxa" w:w="100"/>
+            </w:tcMar>
+          </w:tcPr>
+          <w:p>
+            <w:pPr>
+              <w:jc w:val="center"/>
+            </w:pPr>
+            <w:r>
+              <w:rPr>
+                <w:b/>
+                <w:bCs/>
+              </w:rPr>
+              <w:t xml:space="preserve">TRD (%)</w:t>
+            </w:r>
+          </w:p>
+        </w:tc>
+        <w:tc>
+          <w:tcPr>
+            <w:tcW w:type="dxa" w:w="2800"/>
+            <w:shd w:fill="D9E2F3" w:val="clear"/>
+            <w:tcMar>
+              <w:top w:type="dxa" w:w="60"/>
+              <w:left w:type="dxa" w:w="100"/>
+              <w:bottom w:type="dxa" w:w="60"/>
+              <w:right w:type="dxa" w:w="100"/>
+            </w:tcMar>
+          </w:tcPr>
+          <w:p>
+            <w:pPr>
+              <w:jc w:val="center"/>
+            </w:pPr>
+            <w:r>
+              <w:rPr>
+                <w:b/>
+                <w:bCs/>
+              </w:rPr>
+              <w:t xml:space="preserve">Gap</w:t>
+            </w:r>
+          </w:p>
+        </w:tc>
+        <w:tc>
+          <w:tcPr>
+            <w:tcW w:type="dxa" w:w="3600"/>
+            <w:shd w:fill="D9E2F3" w:val="clear"/>
+            <w:tcMar>
+              <w:top w:type="dxa" w:w="60"/>
+              <w:left w:type="dxa" w:w="100"/>
+              <w:bottom w:type="dxa" w:w="60"/>
+              <w:right w:type="dxa" w:w="100"/>
+            </w:tcMar>
+          </w:tcPr>
+          <w:p>
+            <w:pPr>
+              <w:jc w:val="center"/>
+            </w:pPr>
+            <w:r>
+              <w:rPr>
+                <w:b/>
+                <w:bCs/>
+              </w:rPr>
+              <w:t xml:space="preserve">RBE vs. DenseNet-121 (%)</w:t>
+            </w:r>
+          </w:p>
+        </w:tc>
+      </w:tr>
+      <w:tr>
+        <w:tc>
+          <w:tcPr>
+            <w:tcW w:type="dxa" w:w="4000"/>
+            <w:tcMar>
+              <w:top w:type="dxa" w:w="60"/>
+              <w:left w:type="dxa" w:w="100"/>
+              <w:bottom w:type="dxa" w:w="60"/>
+              <w:right w:type="dxa" w:w="100"/>
+            </w:tcMar>
+          </w:tcPr>
+          <w:p>
+            <w:pPr>
+              <w:jc w:val="center"/>
+            </w:pPr>
+            <w:r>
+              <w:rPr>
+                <w:b w:val="false"/>
+                <w:bCs w:val="false"/>
+              </w:rPr>
+              <w:t xml:space="preserve">ViT-Base/16</w:t>
+            </w:r>
+          </w:p>
+        </w:tc>
+        <w:tc>
+          <w:tcPr>
+            <w:tcW w:type="dxa" w:w="2800"/>
+            <w:tcMar>
+              <w:top w:type="dxa" w:w="60"/>
+              <w:left w:type="dxa" w:w="100"/>
+              <w:bottom w:type="dxa" w:w="60"/>
+              <w:right w:type="dxa" w:w="100"/>
+            </w:tcMar>
+          </w:tcPr>
+          <w:p>
+            <w:pPr>
+              <w:jc w:val="center"/>
+            </w:pPr>
+            <w:r>
+              <w:rPr>
+                <w:b w:val="false"/>
+                <w:bCs w:val="false"/>
+              </w:rPr>
+              <w:t xml:space="preserve">88.81</w:t>
+            </w:r>
+          </w:p>
+        </w:tc>
+        <w:tc>
+          <w:tcPr>
+            <w:tcW w:type="dxa" w:w="2800"/>
+            <w:tcMar>
+              <w:top w:type="dxa" w:w="60"/>
+              <w:left w:type="dxa" w:w="100"/>
+              <w:bottom w:type="dxa" w:w="60"/>
+              <w:right w:type="dxa" w:w="100"/>
+            </w:tcMar>
+          </w:tcPr>
+          <w:p>
+            <w:pPr>
+              <w:jc w:val="center"/>
+            </w:pPr>
+            <w:r>
+              <w:rPr>
+                <w:b w:val="false"/>
+                <w:bCs w:val="false"/>
+              </w:rPr>
+              <w:t xml:space="preserve">0.1085</w:t>
+            </w:r>
+          </w:p>
+        </w:tc>
+        <w:tc>
+          <w:tcPr>
+            <w:tcW w:type="dxa" w:w="3600"/>
+            <w:tcMar>
+              <w:top w:type="dxa" w:w="60"/>
+              <w:left w:type="dxa" w:w="100"/>
+              <w:bottom w:type="dxa" w:w="60"/>
+              <w:right w:type="dxa" w:w="100"/>
+            </w:tcMar>
+          </w:tcPr>
+          <w:p>
+            <w:pPr>
+              <w:jc w:val="center"/>
+            </w:pPr>
+            <w:r>
+              <w:rPr>
+                <w:b w:val="false"/>
+                <w:bCs w:val="false"/>
+              </w:rPr>
+              <w:t xml:space="preserve">26.59</w:t>
+            </w:r>
+          </w:p>
+        </w:tc>
+      </w:tr>
+      <w:tr>
+        <w:tc>
+          <w:tcPr>
+            <w:tcW w:type="dxa" w:w="4000"/>
+            <w:tcMar>
+              <w:top w:type="dxa" w:w="60"/>
+              <w:left w:type="dxa" w:w="100"/>
+              <w:bottom w:type="dxa" w:w="60"/>
+              <w:right w:type="dxa" w:w="100"/>
+            </w:tcMar>
+          </w:tcPr>
+          <w:p>
+            <w:pPr>
+              <w:jc w:val="center"/>
+            </w:pPr>
+            <w:r>
+              <w:rPr>
+                <w:b w:val="false"/>
+                <w:bCs w:val="false"/>
+              </w:rPr>
+              <w:t xml:space="preserve">DenseNet-121 (baseline)</w:t>
+            </w:r>
+          </w:p>
+        </w:tc>
+        <w:tc>
+          <w:tcPr>
+            <w:tcW w:type="dxa" w:w="2800"/>
+            <w:tcMar>
+              <w:top w:type="dxa" w:w="60"/>
+              <w:left w:type="dxa" w:w="100"/>
+              <w:bottom w:type="dxa" w:w="60"/>
+              <w:right w:type="dxa" w:w="100"/>
+            </w:tcMar>
+          </w:tcPr>
+          <w:p>
+            <w:pPr>
+              <w:jc w:val="center"/>
+            </w:pPr>
+            <w:r>
+              <w:rPr>
+                <w:b w:val="false"/>
+                <w:bCs w:val="false"/>
+              </w:rPr>
+              <w:t xml:space="preserve">84.55</w:t>
+            </w:r>
+          </w:p>
+        </w:tc>
+        <w:tc>
+          <w:tcPr>
+            <w:tcW w:type="dxa" w:w="2800"/>
+            <w:tcMar>
+              <w:top w:type="dxa" w:w="60"/>
+              <w:left w:type="dxa" w:w="100"/>
+              <w:bottom w:type="dxa" w:w="60"/>
+              <w:right w:type="dxa" w:w="100"/>
+            </w:tcMar>
+          </w:tcPr>
+          <w:p>
+            <w:pPr>
+              <w:jc w:val="center"/>
+            </w:pPr>
+            <w:r>
+              <w:rPr>
+                <w:b w:val="false"/>
+                <w:bCs w:val="false"/>
+              </w:rPr>
+              <w:t xml:space="preserve">0.1478</w:t>
+            </w:r>
+          </w:p>
+        </w:tc>
+        <w:tc>
+          <w:tcPr>
+            <w:tcW w:type="dxa" w:w="3600"/>
+            <w:tcMar>
+              <w:top w:type="dxa" w:w="60"/>
+              <w:left w:type="dxa" w:w="100"/>
+              <w:bottom w:type="dxa" w:w="60"/>
+              <w:right w:type="dxa" w:w="100"/>
+            </w:tcMar>
+          </w:tcPr>
+          <w:p>
+            <w:pPr>
+              <w:jc w:val="center"/>
+            </w:pPr>
+            <w:r>
+              <w:rPr>
+                <w:b w:val="false"/>
+                <w:bCs w:val="false"/>
+              </w:rPr>
+              <w:t xml:space="preserve">0.00</w:t>
+            </w:r>
+          </w:p>
+        </w:tc>
+      </w:tr>
+    </w:tbl>
+    <w:p>
+      <w:pPr>
+        <w:pStyle w:val="Heading2"/>
+        <w:spacing w:after="80" w:before="160"/>
+      </w:pPr>
+      <w:r>
+        <w:t xml:space="preserve">Rohu</w:t>
+      </w:r>
+    </w:p>
+    <w:tbl>
+      <w:tblPr>
+        <w:tblW w:type="dxa" w:w="13200"/>
+        <w:tblBorders>
+          <w:top w:val="single" w:color="auto" w:sz="4"/>
+          <w:left w:val="single" w:color="auto" w:sz="4"/>
+          <w:bottom w:val="single" w:color="auto" w:sz="4"/>
+          <w:right w:val="single" w:color="auto" w:sz="4"/>
+          <w:insideH w:val="single" w:color="auto" w:sz="4"/>
+          <w:insideV w:val="single" w:color="auto" w:sz="4"/>
+        </w:tblBorders>
+      </w:tblPr>
+      <w:tblGrid>
+        <w:gridCol w:w="4000"/>
+        <w:gridCol w:w="2800"/>
+        <w:gridCol w:w="2800"/>
+        <w:gridCol w:w="3600"/>
+      </w:tblGrid>
+      <w:tr>
+        <w:trPr>
+          <w:tblHeader/>
+        </w:trPr>
+        <w:tc>
+          <w:tcPr>
+            <w:tcW w:type="dxa" w:w="4000"/>
+            <w:shd w:fill="D9E2F3" w:val="clear"/>
+            <w:tcMar>
+              <w:top w:type="dxa" w:w="60"/>
+              <w:left w:type="dxa" w:w="100"/>
+              <w:bottom w:type="dxa" w:w="60"/>
+              <w:right w:type="dxa" w:w="100"/>
+            </w:tcMar>
+          </w:tcPr>
+          <w:p>
+            <w:pPr>
+              <w:jc w:val="center"/>
+            </w:pPr>
+            <w:r>
+              <w:rPr>
+                <w:b/>
+                <w:bCs/>
+              </w:rPr>
+              <w:t xml:space="preserve">Modelo</w:t>
+            </w:r>
+          </w:p>
+        </w:tc>
+        <w:tc>
+          <w:tcPr>
+            <w:tcW w:type="dxa" w:w="2800"/>
+            <w:shd w:fill="D9E2F3" w:val="clear"/>
+            <w:tcMar>
+              <w:top w:type="dxa" w:w="60"/>
+              <w:left w:type="dxa" w:w="100"/>
+              <w:bottom w:type="dxa" w:w="60"/>
+              <w:right w:type="dxa" w:w="100"/>
+            </w:tcMar>
+          </w:tcPr>
+          <w:p>
+            <w:pPr>
+              <w:jc w:val="center"/>
+            </w:pPr>
+            <w:r>
+              <w:rPr>
+                <w:b/>
+                <w:bCs/>
+              </w:rPr>
+              <w:t xml:space="preserve">TRD (%)</w:t>
+            </w:r>
+          </w:p>
+        </w:tc>
+        <w:tc>
+          <w:tcPr>
+            <w:tcW w:type="dxa" w:w="2800"/>
+            <w:shd w:fill="D9E2F3" w:val="clear"/>
+            <w:tcMar>
+              <w:top w:type="dxa" w:w="60"/>
+              <w:left w:type="dxa" w:w="100"/>
+              <w:bottom w:type="dxa" w:w="60"/>
+              <w:right w:type="dxa" w:w="100"/>
+            </w:tcMar>
+          </w:tcPr>
+          <w:p>
+            <w:pPr>
+              <w:jc w:val="center"/>
+            </w:pPr>
+            <w:r>
+              <w:rPr>
+                <w:b/>
+                <w:bCs/>
+              </w:rPr>
+              <w:t xml:space="preserve">Gap</w:t>
+            </w:r>
+          </w:p>
+        </w:tc>
+        <w:tc>
+          <w:tcPr>
+            <w:tcW w:type="dxa" w:w="3600"/>
+            <w:shd w:fill="D9E2F3" w:val="clear"/>
+            <w:tcMar>
+              <w:top w:type="dxa" w:w="60"/>
+              <w:left w:type="dxa" w:w="100"/>
+              <w:bottom w:type="dxa" w:w="60"/>
+              <w:right w:type="dxa" w:w="100"/>
+            </w:tcMar>
+          </w:tcPr>
+          <w:p>
+            <w:pPr>
+              <w:jc w:val="center"/>
+            </w:pPr>
+            <w:r>
+              <w:rPr>
+                <w:b/>
+                <w:bCs/>
+              </w:rPr>
+              <w:t xml:space="preserve">RBE vs. DenseNet-121 (%)</w:t>
+            </w:r>
+          </w:p>
+        </w:tc>
+      </w:tr>
+      <w:tr>
+        <w:tc>
+          <w:tcPr>
+            <w:tcW w:type="dxa" w:w="4000"/>
+            <w:tcMar>
+              <w:top w:type="dxa" w:w="60"/>
+              <w:left w:type="dxa" w:w="100"/>
+              <w:bottom w:type="dxa" w:w="60"/>
+              <w:right w:type="dxa" w:w="100"/>
+            </w:tcMar>
+          </w:tcPr>
+          <w:p>
+            <w:pPr>
+              <w:jc w:val="center"/>
+            </w:pPr>
+            <w:r>
+              <w:rPr>
+                <w:b w:val="false"/>
+                <w:bCs w:val="false"/>
+              </w:rPr>
+              <w:t xml:space="preserve">ViT-Base/16</w:t>
+            </w:r>
+          </w:p>
+        </w:tc>
+        <w:tc>
+          <w:tcPr>
+            <w:tcW w:type="dxa" w:w="2800"/>
+            <w:tcMar>
+              <w:top w:type="dxa" w:w="60"/>
+              <w:left w:type="dxa" w:w="100"/>
+              <w:bottom w:type="dxa" w:w="60"/>
+              <w:right w:type="dxa" w:w="100"/>
+            </w:tcMar>
+          </w:tcPr>
+          <w:p>
+            <w:pPr>
+              <w:jc w:val="center"/>
+            </w:pPr>
+            <w:r>
+              <w:rPr>
+                <w:b w:val="false"/>
+                <w:bCs w:val="false"/>
+              </w:rPr>
+              <w:t xml:space="preserve">90.93</w:t>
+            </w:r>
+          </w:p>
+        </w:tc>
+        <w:tc>
+          <w:tcPr>
+            <w:tcW w:type="dxa" w:w="2800"/>
+            <w:tcMar>
+              <w:top w:type="dxa" w:w="60"/>
+              <w:left w:type="dxa" w:w="100"/>
+              <w:bottom w:type="dxa" w:w="60"/>
+              <w:right w:type="dxa" w:w="100"/>
+            </w:tcMar>
+          </w:tcPr>
+          <w:p>
+            <w:pPr>
+              <w:jc w:val="center"/>
+            </w:pPr>
+            <w:r>
+              <w:rPr>
+                <w:b w:val="false"/>
+                <w:bCs w:val="false"/>
+              </w:rPr>
+              <w:t xml:space="preserve">0.0879</w:t>
+            </w:r>
+          </w:p>
+        </w:tc>
+        <w:tc>
+          <w:tcPr>
+            <w:tcW w:type="dxa" w:w="3600"/>
+            <w:tcMar>
+              <w:top w:type="dxa" w:w="60"/>
+              <w:left w:type="dxa" w:w="100"/>
+              <w:bottom w:type="dxa" w:w="60"/>
+              <w:right w:type="dxa" w:w="100"/>
+            </w:tcMar>
+          </w:tcPr>
+          <w:p>
+            <w:pPr>
+              <w:jc w:val="center"/>
+            </w:pPr>
+            <w:r>
+              <w:rPr>
+                <w:b w:val="false"/>
+                <w:bCs w:val="false"/>
+              </w:rPr>
+              <w:t xml:space="preserve">31.38</w:t>
+            </w:r>
+          </w:p>
+        </w:tc>
+      </w:tr>
+      <w:tr>
+        <w:tc>
+          <w:tcPr>
+            <w:tcW w:type="dxa" w:w="4000"/>
+            <w:tcMar>
+              <w:top w:type="dxa" w:w="60"/>
+              <w:left w:type="dxa" w:w="100"/>
+              <w:bottom w:type="dxa" w:w="60"/>
+              <w:right w:type="dxa" w:w="100"/>
+            </w:tcMar>
+          </w:tcPr>
+          <w:p>
+            <w:pPr>
+              <w:jc w:val="center"/>
+            </w:pPr>
+            <w:r>
+              <w:rPr>
+                <w:b w:val="false"/>
+                <w:bCs w:val="false"/>
+              </w:rPr>
+              <w:t xml:space="preserve">DenseNet-121 (baseline)</w:t>
+            </w:r>
+          </w:p>
+        </w:tc>
+        <w:tc>
+          <w:tcPr>
+            <w:tcW w:type="dxa" w:w="2800"/>
+            <w:tcMar>
+              <w:top w:type="dxa" w:w="60"/>
+              <w:left w:type="dxa" w:w="100"/>
+              <w:bottom w:type="dxa" w:w="60"/>
+              <w:right w:type="dxa" w:w="100"/>
+            </w:tcMar>
+          </w:tcPr>
+          <w:p>
+            <w:pPr>
+              <w:jc w:val="center"/>
+            </w:pPr>
+            <w:r>
+              <w:rPr>
+                <w:b w:val="false"/>
+                <w:bCs w:val="false"/>
+              </w:rPr>
+              <w:t xml:space="preserve">86.61</w:t>
+            </w:r>
+          </w:p>
+        </w:tc>
+        <w:tc>
+          <w:tcPr>
+            <w:tcW w:type="dxa" w:w="2800"/>
+            <w:tcMar>
+              <w:top w:type="dxa" w:w="60"/>
+              <w:left w:type="dxa" w:w="100"/>
+              <w:bottom w:type="dxa" w:w="60"/>
+              <w:right w:type="dxa" w:w="100"/>
+            </w:tcMar>
+          </w:tcPr>
+          <w:p>
+            <w:pPr>
+              <w:jc w:val="center"/>
+            </w:pPr>
+            <w:r>
+              <w:rPr>
+                <w:b w:val="false"/>
+                <w:bCs w:val="false"/>
+              </w:rPr>
+              <w:t xml:space="preserve">0.1281</w:t>
+            </w:r>
+          </w:p>
+        </w:tc>
+        <w:tc>
+          <w:tcPr>
+            <w:tcW w:type="dxa" w:w="3600"/>
+            <w:tcMar>
+              <w:top w:type="dxa" w:w="60"/>
+              <w:left w:type="dxa" w:w="100"/>
+              <w:bottom w:type="dxa" w:w="60"/>
+              <w:right w:type="dxa" w:w="100"/>
+            </w:tcMar>
+          </w:tcPr>
+          <w:p>
+            <w:pPr>
+              <w:jc w:val="center"/>
+            </w:pPr>
+            <w:r>
+              <w:rPr>
+                <w:b w:val="false"/>
+                <w:bCs w:val="false"/>
+              </w:rPr>
+              <w:t xml:space="preserve">0.00</w:t>
+            </w:r>
+          </w:p>
+        </w:tc>
+      </w:tr>
+    </w:tbl>
+    <w:p>
+      <w:pPr>
+        <w:pStyle w:val="Heading1"/>
+        <w:spacing w:after="120" w:before="200"/>
+      </w:pPr>
+      <w:r>
+        <w:t xml:space="preserve">5. Lectura</w:t>
+      </w:r>
+    </w:p>
+    <w:p>
+      <w:pPr>
+        <w:spacing w:after="100"/>
+      </w:pPr>
+      <w:r>
         <w:t xml:space="preserve">ViT-Base/16 rinde por encima de DenseNet-121 en los dos dominios y en ambas variantes, consistente con su desempeño en Mendeley (dominio fuente), donde también es el mejor de los dos (96.96 vs. 95.66).</w:t>
       </w:r>
     </w:p>
@@ -949,6 +2357,14 @@
       </w:pPr>
       <w:r>
         <w:t xml:space="preserve">Frente a Mendeley, los dos dominios objetivo quedan por debajo en ambos modelos — la brecha de generalización cross-dataset que mide el proyecto.</w:t>
+      </w:r>
+    </w:p>
+    <w:p>
+      <w:pPr>
+        <w:spacing w:after="100"/>
+      </w:pPr>
+      <w:r>
+        <w:t xml:space="preserve">ViT-Base/16 retiene más desempeño que DenseNet-121 en los 4 casos (TRD más alto, Gap más chico) y su RBE es siempre positivo — transfiere mejor que el baseline CNN en ambos dominios, con y sin x2. La ventaja de ViT es mayor en Rohu (RBE 35.68% con x2) que en Trucha (RBE 18.15% con x2).</w:t>
       </w:r>
     </w:p>
     <w:p>
@@ -963,7 +2379,7 @@
           <w:sz w:val="18"/>
           <w:szCs w:val="18"/>
         </w:rPr>
-        <w:t xml:space="preserve">Método: congelado (linear probe), backbone con pesos fijos (checkpoint de Mendeley), 30 épocas, patience=8, fold aleatorio (5 folds). Mendeley: evaluación pooled de 5 folds sobre las 8,000 imágenes del dominio fuente.</w:t>
+        <w:t xml:space="preserve">Método: congelado (linear probe), backbone con pesos fijos (checkpoint de Mendeley), 30 épocas, patience=8, fold aleatorio (5 folds). Mendeley: evaluación pooled de 5 folds sobre las 8,000 imágenes del dominio fuente. F1 de Trucha/Rohu: media de 5 folds (misma convención que la tabla maestra del proyecto).</w:t>
       </w:r>
     </w:p>
     <w:sectPr>

</xml_diff>